<commit_message>
Word count article: remove duplicate internal link
Co-Authored-By: Claude Opus 5.5 <noreply@anthropic.com>
Claude-Session: https://claude.ai/code/session_01GQXcnZLn4f9MkUS7SEqp5J
</commit_message>
<xml_diff>
--- a/blog-content/Blog-Post-Word-Count-FINAL.docx
+++ b/blog-content/Blog-Post-Word-Count-FINAL.docx
@@ -198,7 +198,7 @@
         </w:rPr>
         <w:t xml:space="preserve">No. Google's own guide to </w:t>
       </w:r>
-      <w:hyperlink w:history="1" r:id="rIdi0xmy82nqlvfrn8deovld">
+      <w:hyperlink w:history="1" r:id="rId9f6znyvqki153y2ns_qsa">
         <w:r>
           <w:rPr>
             <w:rStyle w:val="Hyperlink"/>
@@ -234,7 +234,7 @@
         </w:rPr>
         <w:t xml:space="preserve">Google's John Mueller has said the same directly: </w:t>
       </w:r>
-      <w:hyperlink w:history="1" r:id="rId7ts2d9hc4hkxpn0r6ibbv">
+      <w:hyperlink w:history="1" r:id="rIdp8kirdlojwtbo56m_xjei">
         <w:r>
           <w:rPr>
             <w:rStyle w:val="Hyperlink"/>
@@ -270,7 +270,7 @@
         </w:rPr>
         <w:t xml:space="preserve">The ranking data agrees. When Backlinko analysed </w:t>
       </w:r>
-      <w:hyperlink w:history="1" r:id="rIdy5hlzu98b_xel5n_ufwnh">
+      <w:hyperlink w:history="1" r:id="rIdpmwe_tjorbwzxvwfcye19">
         <w:r>
           <w:rPr>
             <w:rStyle w:val="Hyperlink"/>
@@ -577,7 +577,7 @@
             <w:tcW w:type="dxa" w:w="1800"/>
           </w:tcPr>
           <w:p>
-            <w:hyperlink w:history="1" r:id="rIdvxxnqdwr0kjmomfsq5ply">
+            <w:hyperlink w:history="1" r:id="rIdlc5d6eumi-hivedsx1may">
               <w:r>
                 <w:rPr>
                   <w:rStyle w:val="Hyperlink"/>
@@ -631,7 +631,7 @@
             <w:tcW w:type="dxa" w:w="1800"/>
           </w:tcPr>
           <w:p>
-            <w:hyperlink w:history="1" r:id="rIdc2nb0u1_i0xp-0w27lroh">
+            <w:hyperlink w:history="1" r:id="rId7k0jqpttwp8tkhth0cfvy">
               <w:r>
                 <w:rPr>
                   <w:rStyle w:val="Hyperlink"/>
@@ -685,7 +685,7 @@
             <w:tcW w:type="dxa" w:w="1800"/>
           </w:tcPr>
           <w:p>
-            <w:hyperlink w:history="1" r:id="rIdbhlh19qipltzud3ka2mwp">
+            <w:hyperlink w:history="1" r:id="rId128mhpy_yeggp6r_lluck">
               <w:r>
                 <w:rPr>
                   <w:rStyle w:val="Hyperlink"/>
@@ -1369,29 +1369,7 @@
           <w:sz w:val="24"/>
           <w:szCs w:val="24"/>
         </w:rPr>
-        <w:t xml:space="preserve">Two of my own articles show the range. </w:t>
-      </w:r>
-      <w:hyperlink w:history="1" r:id="rIdgyytmznkbph69tytfewqg">
-        <w:r>
-          <w:rPr>
-            <w:rStyle w:val="Hyperlink"/>
-            <w:rFonts w:ascii="Calibri" w:cs="Calibri" w:eastAsia="Calibri" w:hAnsi="Calibri"/>
-            <w:color w:val="0563C1"/>
-            <w:sz w:val="24"/>
-            <w:szCs w:val="24"/>
-            <w:u w:val="single"/>
-          </w:rPr>
-          <w:t xml:space="preserve">How to write a blog post using AI</w:t>
-        </w:r>
-      </w:hyperlink>
-      <w:r>
-        <w:rPr>
-          <w:rFonts w:ascii="Calibri" w:cs="Calibri" w:eastAsia="Calibri" w:hAnsi="Calibri"/>
-          <w:color w:val="333333"/>
-          <w:sz w:val="24"/>
-          <w:szCs w:val="24"/>
-        </w:rPr>
-        <w:t xml:space="preserve"> runs over 3,000 words because the process has eight steps and a dozen prompts. This article is much shorter, because the question it answers is simpler.</w:t>
+        <w:t xml:space="preserve">Two of my own articles show the range. My guide to writing a blog post using AI runs over 3,000 words because the process has eight steps and a dozen prompts. This article is much shorter, because the question it answers is simpler.</w:t>
       </w:r>
     </w:p>
     <w:p>
@@ -1438,7 +1416,7 @@
         </w:rPr>
         <w:t xml:space="preserve">What helps is structure: a direct answer of 40–60 words under each question-based heading, specific names and numbers, and clean lists or tables. The full optimisation checklist is in step 7 of </w:t>
       </w:r>
-      <w:hyperlink w:history="1" r:id="rId8qd4p8icenmpsmehwnca6">
+      <w:hyperlink w:history="1" r:id="rIdnqkjzcz5x6fz_ashmvqgh">
         <w:r>
           <w:rPr>
             <w:rStyle w:val="Hyperlink"/>
@@ -1775,7 +1753,7 @@
         </w:rPr>
         <w:t xml:space="preserve">For editing techniques that cut AI filler and add specifics, see </w:t>
       </w:r>
-      <w:hyperlink w:history="1" r:id="rIdawfb6d-rwqj9knzlyf5vq">
+      <w:hyperlink w:history="1" r:id="rIdhcbcjqoukitxd9az5l7-1">
         <w:r>
           <w:rPr>
             <w:rStyle w:val="Hyperlink"/>
@@ -1797,7 +1775,7 @@
         </w:rPr>
         <w:t xml:space="preserve">. Our free </w:t>
       </w:r>
-      <w:hyperlink w:history="1" r:id="rIdpnlscxgsmrhel8q0b6wrw">
+      <w:hyperlink w:history="1" r:id="rIdk48gv6ovtypyry3bcbhrw">
         <w:r>
           <w:rPr>
             <w:rStyle w:val="Hyperlink"/>
@@ -1912,7 +1890,7 @@
         </w:rPr>
         <w:t xml:space="preserve">About six minutes. A </w:t>
       </w:r>
-      <w:hyperlink w:history="1" r:id="rIdmnlrng8msoedl04gymo3j">
+      <w:hyperlink w:history="1" r:id="rIddzxgny7mui0bc1j4iabfb">
         <w:r>
           <w:rPr>
             <w:rStyle w:val="Hyperlink"/>
@@ -1996,7 +1974,7 @@
         </w:rPr>
         <w:t xml:space="preserve">No. A healthy blog mixes short answer posts, step-by-step guides and longer pillar pages, each as long as its topic needs. The </w:t>
       </w:r>
-      <w:hyperlink w:history="1" r:id="rIdvc5iswazn3nmwzmadvkjh">
+      <w:hyperlink w:history="1" r:id="rIdl5n_jvwbtdwr1lyl-w6yc">
         <w:r>
           <w:rPr>
             <w:rStyle w:val="Hyperlink"/>
@@ -2080,7 +2058,7 @@
         </w:rPr>
         <w:t xml:space="preserve">Forget the target number. Work out what the searcher needs, answer it completely, cut what doesn't help, and let the word count land where it lands. If you want a structured starting draft to shape this way, try the free </w:t>
       </w:r>
-      <w:hyperlink w:history="1" r:id="rIdpbvpzbl3jmuoh_do52prn">
+      <w:hyperlink w:history="1" r:id="rIdkvbg_acdfi8pyrhnndhol">
         <w:r>
           <w:rPr>
             <w:rStyle w:val="Hyperlink"/>

</xml_diff>